<commit_message>
Update Technical Documentation and README
</commit_message>
<xml_diff>
--- a/Technical Documentation.docx
+++ b/Technical Documentation.docx
@@ -214,19 +214,29 @@
         </w:rPr>
         <w:t xml:space="preserve"> </w:t>
       </w:r>
-      <w:proofErr w:type="spellStart"/>
-      <w:r>
-        <w:rPr>
-          <w:rFonts w:ascii="Roboto" w:hAnsi="Roboto"/>
-        </w:rPr>
-        <w:t>Vercel</w:t>
-      </w:r>
-      <w:proofErr w:type="spellEnd"/>
-      <w:r>
-        <w:rPr>
-          <w:rFonts w:ascii="Roboto" w:hAnsi="Roboto"/>
-        </w:rPr>
-        <w:t xml:space="preserve"> (Frontend), Render (Backend), MongoDB Atlas (Database)</w:t>
+      <w:r>
+        <w:rPr>
+          <w:rFonts w:ascii="Roboto" w:hAnsi="Roboto"/>
+        </w:rPr>
+        <w:t>Render</w:t>
+      </w:r>
+      <w:r>
+        <w:rPr>
+          <w:rFonts w:ascii="Roboto" w:hAnsi="Roboto"/>
+        </w:rPr>
+        <w:t>,</w:t>
+      </w:r>
+      <w:r>
+        <w:rPr>
+          <w:rFonts w:ascii="Roboto" w:hAnsi="Roboto"/>
+        </w:rPr>
+        <w:t xml:space="preserve"> MongoDB Atlas (Database)</w:t>
+      </w:r>
+      <w:r>
+        <w:rPr>
+          <w:rFonts w:ascii="Roboto" w:hAnsi="Roboto"/>
+        </w:rPr>
+        <w:br/>
       </w:r>
     </w:p>
     <w:p>
@@ -239,9 +249,7 @@
           <w:szCs w:val="24"/>
         </w:rPr>
       </w:pPr>
-    </w:p>
-    <w:p>
-      <w:pPr>
+      <w:r>
         <w:rPr>
           <w:rFonts w:ascii="Roboto" w:hAnsi="Roboto"/>
           <w:b/>
@@ -249,8 +257,91 @@
           <w:sz w:val="24"/>
           <w:szCs w:val="24"/>
         </w:rPr>
-      </w:pPr>
-      <w:r>
+        <w:t>1. Executive Summary</w:t>
+      </w:r>
+    </w:p>
+    <w:p>
+      <w:pPr>
+        <w:rPr>
+          <w:rFonts w:ascii="Roboto" w:hAnsi="Roboto"/>
+        </w:rPr>
+      </w:pPr>
+      <w:proofErr w:type="spellStart"/>
+      <w:r>
+        <w:rPr>
+          <w:rFonts w:ascii="Roboto" w:hAnsi="Roboto"/>
+        </w:rPr>
+        <w:t>StoreIQ</w:t>
+      </w:r>
+      <w:proofErr w:type="spellEnd"/>
+      <w:r>
+        <w:rPr>
+          <w:rFonts w:ascii="Roboto" w:hAnsi="Roboto"/>
+        </w:rPr>
+        <w:t xml:space="preserve"> is an intelligent e-commerce optimization platform designed to solve the </w:t>
+      </w:r>
+      <w:r>
+        <w:rPr>
+          <w:rFonts w:ascii="Roboto" w:hAnsi="Roboto"/>
+          <w:b/>
+          <w:bCs/>
+        </w:rPr>
+        <w:t>Perception Gap</w:t>
+      </w:r>
+      <w:r>
+        <w:rPr>
+          <w:rFonts w:ascii="Roboto" w:hAnsi="Roboto"/>
+        </w:rPr>
+        <w:t xml:space="preserve"> </w:t>
+      </w:r>
+      <w:r>
+        <w:rPr>
+          <w:rFonts w:ascii="Roboto" w:hAnsi="Roboto"/>
+        </w:rPr>
+        <w:t>-</w:t>
+      </w:r>
+      <w:r>
+        <w:rPr>
+          <w:rFonts w:ascii="Roboto" w:hAnsi="Roboto"/>
+        </w:rPr>
+        <w:t xml:space="preserve"> the difference between how merchants describe products and how customers understand them.</w:t>
+      </w:r>
+    </w:p>
+    <w:p>
+      <w:pPr>
+        <w:rPr>
+          <w:rFonts w:ascii="Roboto" w:hAnsi="Roboto"/>
+        </w:rPr>
+      </w:pPr>
+      <w:r>
+        <w:rPr>
+          <w:rFonts w:ascii="Roboto" w:hAnsi="Roboto"/>
+        </w:rPr>
+        <w:t xml:space="preserve">The system performs automated Shopify store audits, detects clarity and trust issues, and generates AI-powered product improvements. By combining AI intelligence with rule-based validation, </w:t>
+      </w:r>
+      <w:proofErr w:type="spellStart"/>
+      <w:r>
+        <w:rPr>
+          <w:rFonts w:ascii="Roboto" w:hAnsi="Roboto"/>
+        </w:rPr>
+        <w:t>StoreIQ</w:t>
+      </w:r>
+      <w:proofErr w:type="spellEnd"/>
+      <w:r>
+        <w:rPr>
+          <w:rFonts w:ascii="Roboto" w:hAnsi="Roboto"/>
+        </w:rPr>
+        <w:t xml:space="preserve"> improves product clarity, builds trust, and increases conversion potential.</w:t>
+      </w:r>
+      <w:r>
+        <w:rPr>
+          <w:rFonts w:ascii="Roboto" w:hAnsi="Roboto"/>
+        </w:rPr>
+        <w:br/>
+      </w:r>
+    </w:p>
+    <w:p>
+      <w:pPr>
         <w:rPr>
           <w:rFonts w:ascii="Roboto" w:hAnsi="Roboto"/>
           <w:b/>
@@ -258,73 +349,8 @@
           <w:sz w:val="24"/>
           <w:szCs w:val="24"/>
         </w:rPr>
-        <w:t>1. Executive Summary</w:t>
-      </w:r>
-    </w:p>
-    <w:p>
-      <w:pPr>
-        <w:rPr>
-          <w:rFonts w:ascii="Roboto" w:hAnsi="Roboto"/>
-        </w:rPr>
-      </w:pPr>
-      <w:proofErr w:type="spellStart"/>
-      <w:r>
-        <w:rPr>
-          <w:rFonts w:ascii="Roboto" w:hAnsi="Roboto"/>
-        </w:rPr>
-        <w:t>StoreIQ</w:t>
-      </w:r>
-      <w:proofErr w:type="spellEnd"/>
-      <w:r>
-        <w:rPr>
-          <w:rFonts w:ascii="Roboto" w:hAnsi="Roboto"/>
-        </w:rPr>
-        <w:t xml:space="preserve"> is an intelligent e-commerce optimization platform designed to solve the </w:t>
-      </w:r>
-      <w:r>
-        <w:rPr>
-          <w:rFonts w:ascii="Roboto" w:hAnsi="Roboto"/>
-          <w:b/>
-          <w:bCs/>
-        </w:rPr>
-        <w:t>Perception Gap</w:t>
-      </w:r>
-      <w:r>
-        <w:rPr>
-          <w:rFonts w:ascii="Roboto" w:hAnsi="Roboto"/>
-        </w:rPr>
-        <w:t xml:space="preserve"> — the difference between how merchants describe products and how customers understand them.</w:t>
-      </w:r>
-    </w:p>
-    <w:p>
-      <w:pPr>
-        <w:rPr>
-          <w:rFonts w:ascii="Roboto" w:hAnsi="Roboto"/>
-        </w:rPr>
-      </w:pPr>
-      <w:r>
-        <w:rPr>
-          <w:rFonts w:ascii="Roboto" w:hAnsi="Roboto"/>
-        </w:rPr>
-        <w:t xml:space="preserve">The system performs automated Shopify store audits, detects clarity and trust issues, and generates AI-powered product improvements. By combining AI intelligence with rule-based validation, </w:t>
-      </w:r>
-      <w:proofErr w:type="spellStart"/>
-      <w:r>
-        <w:rPr>
-          <w:rFonts w:ascii="Roboto" w:hAnsi="Roboto"/>
-        </w:rPr>
-        <w:t>StoreIQ</w:t>
-      </w:r>
-      <w:proofErr w:type="spellEnd"/>
-      <w:r>
-        <w:rPr>
-          <w:rFonts w:ascii="Roboto" w:hAnsi="Roboto"/>
-        </w:rPr>
-        <w:t xml:space="preserve"> improves product clarity, builds trust, and increases conversion potential.</w:t>
-      </w:r>
-    </w:p>
-    <w:p>
-      <w:pPr>
+      </w:pPr>
+      <w:r>
         <w:rPr>
           <w:rFonts w:ascii="Roboto" w:hAnsi="Roboto"/>
           <w:b/>
@@ -332,15 +358,6 @@
           <w:sz w:val="24"/>
           <w:szCs w:val="24"/>
         </w:rPr>
-      </w:pPr>
-      <w:r>
-        <w:rPr>
-          <w:rFonts w:ascii="Roboto" w:hAnsi="Roboto"/>
-          <w:b/>
-          <w:bCs/>
-          <w:sz w:val="24"/>
-          <w:szCs w:val="24"/>
-        </w:rPr>
         <w:t>2. System Architecture</w:t>
       </w:r>
     </w:p>
@@ -391,9 +408,9 @@
           <w:noProof/>
         </w:rPr>
         <w:drawing>
-          <wp:inline distT="0" distB="0" distL="0" distR="0" wp14:anchorId="55FFCF67" wp14:editId="7D796B04">
-            <wp:extent cx="5730240" cy="4435049"/>
-            <wp:effectExtent l="0" t="0" r="3810" b="3810"/>
+          <wp:inline distT="0" distB="0" distL="0" distR="0" wp14:anchorId="55FFCF67" wp14:editId="3DA5AFDE">
+            <wp:extent cx="5661053" cy="4381500"/>
+            <wp:effectExtent l="0" t="0" r="0" b="0"/>
             <wp:docPr id="1701322642" name="Picture 2"/>
             <wp:cNvGraphicFramePr>
               <a:graphicFrameLocks xmlns:a="http://schemas.openxmlformats.org/drawingml/2006/main" noChangeAspect="1"/>
@@ -423,7 +440,7 @@
                   <pic:spPr bwMode="auto">
                     <a:xfrm>
                       <a:off x="0" y="0"/>
-                      <a:ext cx="5732797" cy="4437028"/>
+                      <a:ext cx="5678011" cy="4394625"/>
                     </a:xfrm>
                     <a:prstGeom prst="rect">
                       <a:avLst/>
@@ -444,22 +461,13 @@
       <w:pPr>
         <w:rPr>
           <w:rFonts w:ascii="Roboto" w:hAnsi="Roboto"/>
-        </w:rPr>
-      </w:pPr>
-    </w:p>
-    <w:p>
-      <w:pPr>
-        <w:rPr>
-          <w:rFonts w:ascii="Roboto" w:hAnsi="Roboto"/>
           <w:b/>
           <w:bCs/>
           <w:sz w:val="24"/>
           <w:szCs w:val="24"/>
         </w:rPr>
       </w:pPr>
-    </w:p>
-    <w:p>
-      <w:pPr>
+      <w:r>
         <w:rPr>
           <w:rFonts w:ascii="Roboto" w:hAnsi="Roboto"/>
           <w:b/>
@@ -467,15 +475,7 @@
           <w:sz w:val="24"/>
           <w:szCs w:val="24"/>
         </w:rPr>
-      </w:pPr>
-      <w:r>
-        <w:rPr>
-          <w:rFonts w:ascii="Roboto" w:hAnsi="Roboto"/>
-          <w:b/>
-          <w:bCs/>
-          <w:sz w:val="24"/>
-          <w:szCs w:val="24"/>
-        </w:rPr>
+        <w:lastRenderedPageBreak/>
         <w:t>2.1 Frontend Layer</w:t>
       </w:r>
     </w:p>
@@ -1001,33 +1001,33 @@
         <w:rPr>
           <w:rFonts w:ascii="Roboto" w:hAnsi="Roboto"/>
         </w:rPr>
+        <w:t>Product details like title, description, and images are fetched from Shopify.</w:t>
+      </w:r>
+    </w:p>
+    <w:p>
+      <w:pPr>
+        <w:rPr>
+          <w:rFonts w:ascii="Roboto" w:hAnsi="Roboto"/>
+          <w:b/>
+          <w:bCs/>
+        </w:rPr>
+      </w:pPr>
+    </w:p>
+    <w:p>
+      <w:pPr>
+        <w:rPr>
+          <w:rFonts w:ascii="Roboto" w:hAnsi="Roboto"/>
+          <w:b/>
+          <w:bCs/>
+        </w:rPr>
+      </w:pPr>
+      <w:r>
+        <w:rPr>
+          <w:rFonts w:ascii="Roboto" w:hAnsi="Roboto"/>
+          <w:b/>
+          <w:bCs/>
+        </w:rPr>
         <w:lastRenderedPageBreak/>
-        <w:t>Product details like title, description, and images are fetched from Shopify.</w:t>
-      </w:r>
-    </w:p>
-    <w:p>
-      <w:pPr>
-        <w:rPr>
-          <w:rFonts w:ascii="Roboto" w:hAnsi="Roboto"/>
-          <w:b/>
-          <w:bCs/>
-        </w:rPr>
-      </w:pPr>
-    </w:p>
-    <w:p>
-      <w:pPr>
-        <w:rPr>
-          <w:rFonts w:ascii="Roboto" w:hAnsi="Roboto"/>
-          <w:b/>
-          <w:bCs/>
-        </w:rPr>
-      </w:pPr>
-      <w:r>
-        <w:rPr>
-          <w:rFonts w:ascii="Roboto" w:hAnsi="Roboto"/>
-          <w:b/>
-          <w:bCs/>
-        </w:rPr>
         <w:t>Step 2: AI Analysis</w:t>
       </w:r>
     </w:p>
@@ -1505,7 +1505,6 @@
           <w:b/>
           <w:bCs/>
         </w:rPr>
-        <w:lastRenderedPageBreak/>
         <w:t>AI Score (60%)</w:t>
       </w:r>
       <w:r>
@@ -1546,6 +1545,7 @@
         <w:rPr>
           <w:rFonts w:ascii="Roboto" w:hAnsi="Roboto"/>
         </w:rPr>
+        <w:lastRenderedPageBreak/>
         <w:t xml:space="preserve">Relevance </w:t>
       </w:r>
     </w:p>
@@ -2049,7 +2049,6 @@
         <w:rPr>
           <w:rFonts w:ascii="Roboto" w:hAnsi="Roboto"/>
         </w:rPr>
-        <w:lastRenderedPageBreak/>
         <w:t xml:space="preserve">GET /connection-status </w:t>
       </w:r>
       <w:r>
@@ -2720,7 +2719,6 @@
           <w:sz w:val="24"/>
           <w:szCs w:val="24"/>
         </w:rPr>
-        <w:lastRenderedPageBreak/>
         <w:t>8. Deployment Architecture</w:t>
       </w:r>
     </w:p>
@@ -2742,14 +2740,14 @@
           <w:sz w:val="24"/>
           <w:szCs w:val="24"/>
         </w:rPr>
-        <w:t>Backend (Render)</w:t>
+        <w:t>Live Deployment</w:t>
       </w:r>
     </w:p>
     <w:p>
       <w:pPr>
         <w:numPr>
           <w:ilvl w:val="0"/>
-          <w:numId w:val="21"/>
+          <w:numId w:val="28"/>
         </w:numPr>
         <w:rPr>
           <w:rFonts w:ascii="Roboto" w:hAnsi="Roboto"/>
@@ -2758,15 +2756,33 @@
       <w:r>
         <w:rPr>
           <w:rFonts w:ascii="Roboto" w:hAnsi="Roboto"/>
-        </w:rPr>
-        <w:t xml:space="preserve">Node.js server deployed as Web Service </w:t>
-      </w:r>
+          <w:b/>
+          <w:bCs/>
+        </w:rPr>
+        <w:lastRenderedPageBreak/>
+        <w:t>Application URL:</w:t>
+      </w:r>
+      <w:r>
+        <w:rPr>
+          <w:rFonts w:ascii="Roboto" w:hAnsi="Roboto"/>
+        </w:rPr>
+        <w:t xml:space="preserve"> </w:t>
+      </w:r>
+      <w:hyperlink r:id="rId6" w:tgtFrame="_new" w:history="1">
+        <w:r>
+          <w:rPr>
+            <w:rStyle w:val="Hyperlink"/>
+            <w:rFonts w:ascii="Roboto" w:hAnsi="Roboto"/>
+          </w:rPr>
+          <w:t>https://storeiq-9ttz.onrender.com</w:t>
+        </w:r>
+      </w:hyperlink>
     </w:p>
     <w:p>
       <w:pPr>
         <w:numPr>
           <w:ilvl w:val="0"/>
-          <w:numId w:val="21"/>
+          <w:numId w:val="28"/>
         </w:numPr>
         <w:rPr>
           <w:rFonts w:ascii="Roboto" w:hAnsi="Roboto"/>
@@ -2776,15 +2792,14 @@
         <w:rPr>
           <w:rFonts w:ascii="Roboto" w:hAnsi="Roboto"/>
         </w:rPr>
-        <w:t xml:space="preserve">Environment variables configured securely </w:t>
-      </w:r>
-    </w:p>
-    <w:p>
-      <w:pPr>
-        <w:rPr>
-          <w:rFonts w:ascii="Roboto" w:hAnsi="Roboto"/>
-        </w:rPr>
-      </w:pPr>
+        <w:t xml:space="preserve">The platform is deployed and accessible as a live web application, enabling real-time interaction with Shopify stores. </w:t>
+      </w:r>
+      <w:r>
+        <w:rPr>
+          <w:rFonts w:ascii="Roboto" w:hAnsi="Roboto"/>
+        </w:rPr>
+        <w:br/>
+      </w:r>
     </w:p>
     <w:p>
       <w:pPr>
@@ -2804,10 +2819,68 @@
           <w:sz w:val="24"/>
           <w:szCs w:val="24"/>
         </w:rPr>
-        <w:t>Frontend (</w:t>
-      </w:r>
-      <w:proofErr w:type="spellStart"/>
-      <w:r>
+        <w:t>Backend (Render)</w:t>
+      </w:r>
+    </w:p>
+    <w:p>
+      <w:pPr>
+        <w:numPr>
+          <w:ilvl w:val="0"/>
+          <w:numId w:val="29"/>
+        </w:numPr>
+        <w:rPr>
+          <w:rFonts w:ascii="Roboto" w:hAnsi="Roboto"/>
+        </w:rPr>
+      </w:pPr>
+      <w:r>
+        <w:rPr>
+          <w:rFonts w:ascii="Roboto" w:hAnsi="Roboto"/>
+        </w:rPr>
+        <w:t xml:space="preserve">Node.js server deployed as a Web Service on Render </w:t>
+      </w:r>
+    </w:p>
+    <w:p>
+      <w:pPr>
+        <w:numPr>
+          <w:ilvl w:val="0"/>
+          <w:numId w:val="29"/>
+        </w:numPr>
+        <w:rPr>
+          <w:rFonts w:ascii="Roboto" w:hAnsi="Roboto"/>
+        </w:rPr>
+      </w:pPr>
+      <w:r>
+        <w:rPr>
+          <w:rFonts w:ascii="Roboto" w:hAnsi="Roboto"/>
+        </w:rPr>
+        <w:t xml:space="preserve">Handles API requests, AI processing, and Shopify integration </w:t>
+      </w:r>
+    </w:p>
+    <w:p>
+      <w:pPr>
+        <w:numPr>
+          <w:ilvl w:val="0"/>
+          <w:numId w:val="29"/>
+        </w:numPr>
+        <w:rPr>
+          <w:rFonts w:ascii="Roboto" w:hAnsi="Roboto"/>
+        </w:rPr>
+      </w:pPr>
+      <w:r>
+        <w:rPr>
+          <w:rFonts w:ascii="Roboto" w:hAnsi="Roboto"/>
+        </w:rPr>
+        <w:t xml:space="preserve">Environment variables configured securely </w:t>
+      </w:r>
+      <w:r>
+        <w:rPr>
+          <w:rFonts w:ascii="Roboto" w:hAnsi="Roboto"/>
+        </w:rPr>
+        <w:br/>
+      </w:r>
+    </w:p>
+    <w:p>
+      <w:pPr>
         <w:rPr>
           <w:rFonts w:ascii="Roboto" w:hAnsi="Roboto"/>
           <w:b/>
@@ -2815,9 +2888,7 @@
           <w:sz w:val="24"/>
           <w:szCs w:val="24"/>
         </w:rPr>
-        <w:t>Vercel</w:t>
-      </w:r>
-      <w:proofErr w:type="spellEnd"/>
+      </w:pPr>
       <w:r>
         <w:rPr>
           <w:rFonts w:ascii="Roboto" w:hAnsi="Roboto"/>
@@ -2826,14 +2897,14 @@
           <w:sz w:val="24"/>
           <w:szCs w:val="24"/>
         </w:rPr>
-        <w:t>)</w:t>
+        <w:t>Frontend</w:t>
       </w:r>
     </w:p>
     <w:p>
       <w:pPr>
         <w:numPr>
           <w:ilvl w:val="0"/>
-          <w:numId w:val="22"/>
+          <w:numId w:val="30"/>
         </w:numPr>
         <w:rPr>
           <w:rFonts w:ascii="Roboto" w:hAnsi="Roboto"/>
@@ -2843,14 +2914,14 @@
         <w:rPr>
           <w:rFonts w:ascii="Roboto" w:hAnsi="Roboto"/>
         </w:rPr>
-        <w:t xml:space="preserve">React app deployed with global CDN </w:t>
+        <w:t xml:space="preserve">Integrated with backend deployment on Render </w:t>
       </w:r>
     </w:p>
     <w:p>
       <w:pPr>
         <w:numPr>
           <w:ilvl w:val="0"/>
-          <w:numId w:val="22"/>
+          <w:numId w:val="30"/>
         </w:numPr>
         <w:rPr>
           <w:rFonts w:ascii="Roboto" w:hAnsi="Roboto"/>
@@ -2860,15 +2931,14 @@
         <w:rPr>
           <w:rFonts w:ascii="Roboto" w:hAnsi="Roboto"/>
         </w:rPr>
-        <w:t xml:space="preserve">Connected to backend API </w:t>
-      </w:r>
-    </w:p>
-    <w:p>
-      <w:pPr>
-        <w:rPr>
-          <w:rFonts w:ascii="Roboto" w:hAnsi="Roboto"/>
-        </w:rPr>
-      </w:pPr>
+        <w:t xml:space="preserve">Provides user interface for store connection, audit, and optimization </w:t>
+      </w:r>
+      <w:r>
+        <w:rPr>
+          <w:rFonts w:ascii="Roboto" w:hAnsi="Roboto"/>
+        </w:rPr>
+        <w:br/>
+      </w:r>
     </w:p>
     <w:p>
       <w:pPr>
@@ -2895,7 +2965,7 @@
       <w:pPr>
         <w:numPr>
           <w:ilvl w:val="0"/>
-          <w:numId w:val="23"/>
+          <w:numId w:val="31"/>
         </w:numPr>
         <w:rPr>
           <w:rFonts w:ascii="Roboto" w:hAnsi="Roboto"/>
@@ -2912,7 +2982,7 @@
       <w:pPr>
         <w:numPr>
           <w:ilvl w:val="0"/>
-          <w:numId w:val="23"/>
+          <w:numId w:val="31"/>
         </w:numPr>
         <w:rPr>
           <w:rFonts w:ascii="Roboto" w:hAnsi="Roboto"/>
@@ -2922,7 +2992,119 @@
         <w:rPr>
           <w:rFonts w:ascii="Roboto" w:hAnsi="Roboto"/>
         </w:rPr>
-        <w:t xml:space="preserve">Enables scalable storage and analytics </w:t>
+        <w:t xml:space="preserve">Stores audit history and performance tracking </w:t>
+      </w:r>
+    </w:p>
+    <w:p>
+      <w:pPr>
+        <w:numPr>
+          <w:ilvl w:val="0"/>
+          <w:numId w:val="31"/>
+        </w:numPr>
+        <w:rPr>
+          <w:rFonts w:ascii="Roboto" w:hAnsi="Roboto"/>
+        </w:rPr>
+      </w:pPr>
+      <w:r>
+        <w:rPr>
+          <w:rFonts w:ascii="Roboto" w:hAnsi="Roboto"/>
+        </w:rPr>
+        <w:t xml:space="preserve">Ensures scalability and persistence </w:t>
+      </w:r>
+      <w:r>
+        <w:rPr>
+          <w:rFonts w:ascii="Roboto" w:hAnsi="Roboto"/>
+        </w:rPr>
+        <w:br/>
+      </w:r>
+    </w:p>
+    <w:p>
+      <w:pPr>
+        <w:rPr>
+          <w:rFonts w:ascii="Roboto" w:hAnsi="Roboto"/>
+          <w:b/>
+          <w:bCs/>
+          <w:sz w:val="24"/>
+          <w:szCs w:val="24"/>
+        </w:rPr>
+      </w:pPr>
+      <w:r>
+        <w:rPr>
+          <w:rFonts w:ascii="Roboto" w:hAnsi="Roboto"/>
+          <w:b/>
+          <w:bCs/>
+          <w:sz w:val="24"/>
+          <w:szCs w:val="24"/>
+        </w:rPr>
+        <w:t>Deployment Workflow</w:t>
+      </w:r>
+    </w:p>
+    <w:p>
+      <w:pPr>
+        <w:numPr>
+          <w:ilvl w:val="0"/>
+          <w:numId w:val="32"/>
+        </w:numPr>
+        <w:rPr>
+          <w:rFonts w:ascii="Roboto" w:hAnsi="Roboto"/>
+        </w:rPr>
+      </w:pPr>
+      <w:r>
+        <w:rPr>
+          <w:rFonts w:ascii="Roboto" w:hAnsi="Roboto"/>
+        </w:rPr>
+        <w:t xml:space="preserve">Backend deployed on Render </w:t>
+      </w:r>
+    </w:p>
+    <w:p>
+      <w:pPr>
+        <w:numPr>
+          <w:ilvl w:val="0"/>
+          <w:numId w:val="32"/>
+        </w:numPr>
+        <w:rPr>
+          <w:rFonts w:ascii="Roboto" w:hAnsi="Roboto"/>
+        </w:rPr>
+      </w:pPr>
+      <w:r>
+        <w:rPr>
+          <w:rFonts w:ascii="Roboto" w:hAnsi="Roboto"/>
+        </w:rPr>
+        <w:t xml:space="preserve">Environment variables configured securely </w:t>
+      </w:r>
+    </w:p>
+    <w:p>
+      <w:pPr>
+        <w:numPr>
+          <w:ilvl w:val="0"/>
+          <w:numId w:val="32"/>
+        </w:numPr>
+        <w:rPr>
+          <w:rFonts w:ascii="Roboto" w:hAnsi="Roboto"/>
+        </w:rPr>
+      </w:pPr>
+      <w:r>
+        <w:rPr>
+          <w:rFonts w:ascii="Roboto" w:hAnsi="Roboto"/>
+        </w:rPr>
+        <w:t xml:space="preserve">MongoDB Atlas connected for persistence </w:t>
+      </w:r>
+    </w:p>
+    <w:p>
+      <w:pPr>
+        <w:numPr>
+          <w:ilvl w:val="0"/>
+          <w:numId w:val="32"/>
+        </w:numPr>
+        <w:rPr>
+          <w:rFonts w:ascii="Roboto" w:hAnsi="Roboto"/>
+        </w:rPr>
+      </w:pPr>
+      <w:r>
+        <w:rPr>
+          <w:rFonts w:ascii="Roboto" w:hAnsi="Roboto"/>
+        </w:rPr>
+        <w:t>Application tested with live Shopify store integration</w:t>
       </w:r>
     </w:p>
     <w:p>
@@ -3116,6 +3298,7 @@
         <w:rPr>
           <w:rFonts w:ascii="Roboto" w:hAnsi="Roboto"/>
         </w:rPr>
+        <w:lastRenderedPageBreak/>
         <w:t xml:space="preserve">Audit is performed </w:t>
       </w:r>
     </w:p>
@@ -3236,416 +3419,340 @@
       <w:pPr>
         <w:rPr>
           <w:rFonts w:ascii="Roboto" w:hAnsi="Roboto"/>
+        </w:rPr>
+      </w:pPr>
+      <w:proofErr w:type="spellStart"/>
+      <w:r>
+        <w:rPr>
+          <w:rFonts w:ascii="Roboto" w:hAnsi="Roboto"/>
+        </w:rPr>
+        <w:t>StoreIQ</w:t>
+      </w:r>
+      <w:proofErr w:type="spellEnd"/>
+      <w:r>
+        <w:rPr>
+          <w:rFonts w:ascii="Roboto" w:hAnsi="Roboto"/>
+        </w:rPr>
+        <w:t xml:space="preserve"> uses a hybrid architecture combining AI and deterministic logic for reliability and intelligence.</w:t>
+      </w:r>
+      <w:r>
+        <w:rPr>
+          <w:rFonts w:ascii="Roboto" w:hAnsi="Roboto"/>
+        </w:rPr>
+        <w:br/>
+        <w:t>AI models handle perception-based tasks such as clarity analysis and content generation, while deterministic logic ensures measurable validation like image presence and content length.</w:t>
+      </w:r>
+      <w:r>
+        <w:rPr>
+          <w:rFonts w:ascii="Roboto" w:hAnsi="Roboto"/>
+        </w:rPr>
+        <w:br/>
+        <w:t>A decoupled system (React + Node + MongoDB) was chosen for scalability and flexibility.</w:t>
+      </w:r>
+      <w:r>
+        <w:rPr>
+          <w:rFonts w:ascii="Roboto" w:hAnsi="Roboto"/>
+        </w:rPr>
+        <w:br/>
+        <w:t>Multi-model fallback (</w:t>
+      </w:r>
+      <w:proofErr w:type="spellStart"/>
+      <w:r>
+        <w:rPr>
+          <w:rFonts w:ascii="Roboto" w:hAnsi="Roboto"/>
+        </w:rPr>
+        <w:t>Groq</w:t>
+      </w:r>
+      <w:proofErr w:type="spellEnd"/>
+      <w:r>
+        <w:rPr>
+          <w:rFonts w:ascii="Roboto" w:hAnsi="Roboto"/>
+        </w:rPr>
+        <w:t xml:space="preserve"> </w:t>
+      </w:r>
+      <w:r>
+        <w:rPr>
+          <w:rFonts w:ascii="Times New Roman" w:hAnsi="Times New Roman" w:cs="Times New Roman"/>
+        </w:rPr>
+        <w:t>→</w:t>
+      </w:r>
+      <w:r>
+        <w:rPr>
+          <w:rFonts w:ascii="Roboto" w:hAnsi="Roboto"/>
+        </w:rPr>
+        <w:t xml:space="preserve"> Gemini) ensures uninterrupted AI processing.</w:t>
+      </w:r>
+    </w:p>
+    <w:p>
+      <w:pPr>
+        <w:rPr>
+          <w:rFonts w:ascii="Roboto" w:hAnsi="Roboto"/>
+          <w:b/>
+          <w:bCs/>
           <w:sz w:val="24"/>
           <w:szCs w:val="24"/>
         </w:rPr>
       </w:pPr>
-      <w:proofErr w:type="spellStart"/>
-      <w:r>
-        <w:rPr>
-          <w:rFonts w:ascii="Roboto" w:hAnsi="Roboto"/>
+    </w:p>
+    <w:p>
+      <w:pPr>
+        <w:rPr>
+          <w:rFonts w:ascii="Roboto" w:hAnsi="Roboto"/>
+          <w:b/>
+          <w:bCs/>
           <w:sz w:val="24"/>
           <w:szCs w:val="24"/>
         </w:rPr>
-        <w:t>StoreIQ</w:t>
-      </w:r>
-      <w:proofErr w:type="spellEnd"/>
-      <w:r>
-        <w:rPr>
-          <w:rFonts w:ascii="Roboto" w:hAnsi="Roboto"/>
+      </w:pPr>
+      <w:r>
+        <w:rPr>
+          <w:rFonts w:ascii="Roboto" w:hAnsi="Roboto"/>
+          <w:b/>
+          <w:bCs/>
           <w:sz w:val="24"/>
           <w:szCs w:val="24"/>
         </w:rPr>
-        <w:t xml:space="preserve"> uses a hybrid architecture combining AI and deterministic logic for reliability and intelligence.</w:t>
-      </w:r>
-      <w:r>
-        <w:rPr>
-          <w:rFonts w:ascii="Roboto" w:hAnsi="Roboto"/>
+        <w:t>11. AI vs Deterministic Logic</w:t>
+      </w:r>
+    </w:p>
+    <w:p>
+      <w:pPr>
+        <w:rPr>
+          <w:rFonts w:ascii="Roboto" w:hAnsi="Roboto"/>
+        </w:rPr>
+      </w:pPr>
+      <w:r>
+        <w:rPr>
+          <w:rFonts w:ascii="Roboto" w:hAnsi="Roboto"/>
+        </w:rPr>
+        <w:t>AI is used for subjective tasks such as understanding clarity, detecting missing details, and generating improved descriptions.</w:t>
+      </w:r>
+      <w:r>
+        <w:rPr>
+          <w:rFonts w:ascii="Roboto" w:hAnsi="Roboto"/>
+        </w:rPr>
+        <w:br/>
+        <w:t>Deterministic logic handles objective checks like image count, description length, and policy validation.</w:t>
+      </w:r>
+      <w:r>
+        <w:rPr>
+          <w:rFonts w:ascii="Roboto" w:hAnsi="Roboto"/>
+        </w:rPr>
+        <w:br/>
+        <w:t>This separation ensures reliability in critical checks while leveraging AI for intelligent improvements.</w:t>
+      </w:r>
+      <w:r>
+        <w:rPr>
+          <w:rFonts w:ascii="Roboto" w:hAnsi="Roboto"/>
+        </w:rPr>
+        <w:br/>
+        <w:t>The hybrid scoring system balances both approaches effectively.</w:t>
+      </w:r>
+    </w:p>
+    <w:p>
+      <w:pPr>
+        <w:rPr>
+          <w:rFonts w:ascii="Roboto" w:hAnsi="Roboto"/>
+          <w:b/>
+          <w:bCs/>
           <w:sz w:val="24"/>
           <w:szCs w:val="24"/>
         </w:rPr>
-        <w:br/>
-      </w:r>
-      <w:r>
-        <w:rPr>
-          <w:rFonts w:ascii="Roboto" w:hAnsi="Roboto"/>
+      </w:pPr>
+    </w:p>
+    <w:p>
+      <w:pPr>
+        <w:rPr>
+          <w:rFonts w:ascii="Roboto" w:hAnsi="Roboto"/>
+          <w:b/>
+          <w:bCs/>
           <w:sz w:val="24"/>
           <w:szCs w:val="24"/>
         </w:rPr>
-        <w:lastRenderedPageBreak/>
-        <w:t>AI models handle perception-based tasks such as clarity analysis and content generation, while deterministic logic ensures measurable validation like image presence and content length.</w:t>
-      </w:r>
-      <w:r>
-        <w:rPr>
-          <w:rFonts w:ascii="Roboto" w:hAnsi="Roboto"/>
+      </w:pPr>
+      <w:r>
+        <w:rPr>
+          <w:rFonts w:ascii="Roboto" w:hAnsi="Roboto"/>
+          <w:b/>
+          <w:bCs/>
           <w:sz w:val="24"/>
           <w:szCs w:val="24"/>
         </w:rPr>
+        <w:t>12. Failure Handling &amp; System Degradation</w:t>
+      </w:r>
+    </w:p>
+    <w:p>
+      <w:pPr>
+        <w:rPr>
+          <w:rFonts w:ascii="Roboto" w:hAnsi="Roboto"/>
+        </w:rPr>
+      </w:pPr>
+      <w:r>
+        <w:rPr>
+          <w:rFonts w:ascii="Roboto" w:hAnsi="Roboto"/>
+        </w:rPr>
+        <w:t>If the Shopify API fails, the system stops the audit and informs the user without crashing.</w:t>
+      </w:r>
+      <w:r>
+        <w:rPr>
+          <w:rFonts w:ascii="Roboto" w:hAnsi="Roboto"/>
+        </w:rPr>
         <w:br/>
-        <w:t>A decoupled system (React + Node + MongoDB) was chosen for scalability and flexibility.</w:t>
-      </w:r>
-      <w:r>
-        <w:rPr>
-          <w:rFonts w:ascii="Roboto" w:hAnsi="Roboto"/>
+        <w:t>If the primary AI (</w:t>
+      </w:r>
+      <w:proofErr w:type="spellStart"/>
+      <w:r>
+        <w:rPr>
+          <w:rFonts w:ascii="Roboto" w:hAnsi="Roboto"/>
+        </w:rPr>
+        <w:t>Groq</w:t>
+      </w:r>
+      <w:proofErr w:type="spellEnd"/>
+      <w:r>
+        <w:rPr>
+          <w:rFonts w:ascii="Roboto" w:hAnsi="Roboto"/>
+        </w:rPr>
+        <w:t>) fails, the system switches to Gemini automatically.</w:t>
+      </w:r>
+      <w:r>
+        <w:rPr>
+          <w:rFonts w:ascii="Roboto" w:hAnsi="Roboto"/>
+        </w:rPr>
+        <w:br/>
+        <w:t>If both AI models fail, the system falls back to rule-based scoring.</w:t>
+      </w:r>
+      <w:r>
+        <w:rPr>
+          <w:rFonts w:ascii="Roboto" w:hAnsi="Roboto"/>
+        </w:rPr>
+        <w:br/>
+        <w:t>Invalid AI responses are filtered, and safe fallback outputs are shown.</w:t>
+      </w:r>
+      <w:r>
+        <w:rPr>
+          <w:rFonts w:ascii="Roboto" w:hAnsi="Roboto"/>
+        </w:rPr>
+        <w:br/>
+        <w:t>Unexpected user input is validated to prevent system failure.</w:t>
+      </w:r>
+    </w:p>
+    <w:p>
+      <w:pPr>
+        <w:rPr>
+          <w:rFonts w:ascii="Roboto" w:hAnsi="Roboto"/>
+          <w:b/>
+          <w:bCs/>
           <w:sz w:val="24"/>
           <w:szCs w:val="24"/>
         </w:rPr>
-        <w:br/>
-        <w:t>Multi-model fallback (</w:t>
-      </w:r>
-      <w:proofErr w:type="spellStart"/>
-      <w:r>
-        <w:rPr>
-          <w:rFonts w:ascii="Roboto" w:hAnsi="Roboto"/>
+      </w:pPr>
+    </w:p>
+    <w:p>
+      <w:pPr>
+        <w:rPr>
+          <w:rFonts w:ascii="Roboto" w:hAnsi="Roboto"/>
+          <w:b/>
+          <w:bCs/>
           <w:sz w:val="24"/>
           <w:szCs w:val="24"/>
         </w:rPr>
-        <w:t>Groq</w:t>
-      </w:r>
-      <w:proofErr w:type="spellEnd"/>
-      <w:r>
-        <w:rPr>
-          <w:rFonts w:ascii="Roboto" w:hAnsi="Roboto"/>
+      </w:pPr>
+      <w:r>
+        <w:rPr>
+          <w:rFonts w:ascii="Roboto" w:hAnsi="Roboto"/>
+          <w:b/>
+          <w:bCs/>
           <w:sz w:val="24"/>
           <w:szCs w:val="24"/>
         </w:rPr>
-        <w:t xml:space="preserve"> </w:t>
-      </w:r>
-      <w:r>
-        <w:rPr>
-          <w:rFonts w:ascii="Times New Roman" w:hAnsi="Times New Roman" w:cs="Times New Roman"/>
+        <w:t>13. Known Limitations &amp; Future Improvements</w:t>
+      </w:r>
+    </w:p>
+    <w:p>
+      <w:pPr>
+        <w:rPr>
+          <w:rFonts w:ascii="Roboto" w:hAnsi="Roboto"/>
+        </w:rPr>
+      </w:pPr>
+      <w:r>
+        <w:rPr>
+          <w:rFonts w:ascii="Roboto" w:hAnsi="Roboto"/>
+        </w:rPr>
+        <w:t>AI suggestions may vary depending on input quality.</w:t>
+      </w:r>
+      <w:r>
+        <w:rPr>
+          <w:rFonts w:ascii="Roboto" w:hAnsi="Roboto"/>
+        </w:rPr>
+        <w:br/>
+        <w:t>Image analysis is currently limited to availability checks.</w:t>
+      </w:r>
+      <w:r>
+        <w:rPr>
+          <w:rFonts w:ascii="Roboto" w:hAnsi="Roboto"/>
+        </w:rPr>
+        <w:br/>
+        <w:t>System depends on external APIs, which may introduce delays.</w:t>
+      </w:r>
+      <w:r>
+        <w:rPr>
+          <w:rFonts w:ascii="Roboto" w:hAnsi="Roboto"/>
+        </w:rPr>
+        <w:br/>
+        <w:t>Future improvements include advanced image analysis, better prompt tuning, and personalized recommendations.</w:t>
+      </w:r>
+    </w:p>
+    <w:p>
+      <w:pPr>
+        <w:rPr>
+          <w:rFonts w:ascii="Roboto" w:hAnsi="Roboto"/>
+        </w:rPr>
+      </w:pPr>
+    </w:p>
+    <w:p>
+      <w:pPr>
+        <w:rPr>
+          <w:rFonts w:ascii="Roboto" w:hAnsi="Roboto"/>
+          <w:b/>
+          <w:bCs/>
           <w:sz w:val="24"/>
           <w:szCs w:val="24"/>
         </w:rPr>
-        <w:t>→</w:t>
-      </w:r>
-      <w:r>
-        <w:rPr>
-          <w:rFonts w:ascii="Roboto" w:hAnsi="Roboto"/>
+      </w:pPr>
+      <w:r>
+        <w:rPr>
+          <w:rFonts w:ascii="Roboto" w:hAnsi="Roboto"/>
+          <w:b/>
+          <w:bCs/>
           <w:sz w:val="24"/>
           <w:szCs w:val="24"/>
         </w:rPr>
-        <w:t xml:space="preserve"> Gemini) ensures uninterrupted AI processing.</w:t>
-      </w:r>
-    </w:p>
-    <w:p>
-      <w:pPr>
-        <w:rPr>
-          <w:rFonts w:ascii="Roboto" w:hAnsi="Roboto"/>
-          <w:b/>
-          <w:bCs/>
-          <w:sz w:val="24"/>
-          <w:szCs w:val="24"/>
-        </w:rPr>
-      </w:pPr>
-    </w:p>
-    <w:p>
-      <w:pPr>
-        <w:rPr>
-          <w:rFonts w:ascii="Roboto" w:hAnsi="Roboto"/>
-          <w:b/>
-          <w:bCs/>
-          <w:sz w:val="24"/>
-          <w:szCs w:val="24"/>
-        </w:rPr>
-      </w:pPr>
-      <w:r>
-        <w:rPr>
-          <w:rFonts w:ascii="Roboto" w:hAnsi="Roboto"/>
-          <w:b/>
-          <w:bCs/>
-          <w:sz w:val="24"/>
-          <w:szCs w:val="24"/>
-        </w:rPr>
-        <w:t>11. AI vs Deterministic Logic</w:t>
-      </w:r>
-    </w:p>
-    <w:p>
-      <w:pPr>
-        <w:rPr>
-          <w:rFonts w:ascii="Roboto" w:hAnsi="Roboto"/>
-          <w:sz w:val="24"/>
-          <w:szCs w:val="24"/>
-        </w:rPr>
-      </w:pPr>
-      <w:r>
-        <w:rPr>
-          <w:rFonts w:ascii="Roboto" w:hAnsi="Roboto"/>
-          <w:sz w:val="24"/>
-          <w:szCs w:val="24"/>
-        </w:rPr>
-        <w:t>AI is used for subjective tasks such as understanding clarity, detecting missing details, and generating improved descriptions.</w:t>
-      </w:r>
-      <w:r>
-        <w:rPr>
-          <w:rFonts w:ascii="Roboto" w:hAnsi="Roboto"/>
-          <w:sz w:val="24"/>
-          <w:szCs w:val="24"/>
-        </w:rPr>
-        <w:br/>
-        <w:t>Deterministic logic handles objective checks like image count, description length, and policy validation.</w:t>
-      </w:r>
-      <w:r>
-        <w:rPr>
-          <w:rFonts w:ascii="Roboto" w:hAnsi="Roboto"/>
-          <w:sz w:val="24"/>
-          <w:szCs w:val="24"/>
-        </w:rPr>
-        <w:br/>
-        <w:t>This separation ensures reliability in critical checks while leveraging AI for intelligent improvements.</w:t>
-      </w:r>
-      <w:r>
-        <w:rPr>
-          <w:rFonts w:ascii="Roboto" w:hAnsi="Roboto"/>
-          <w:sz w:val="24"/>
-          <w:szCs w:val="24"/>
-        </w:rPr>
-        <w:br/>
-        <w:t>The hybrid scoring system balances both approaches effectively.</w:t>
-      </w:r>
-    </w:p>
-    <w:p>
-      <w:pPr>
-        <w:rPr>
-          <w:rFonts w:ascii="Roboto" w:hAnsi="Roboto"/>
-          <w:b/>
-          <w:bCs/>
-          <w:sz w:val="24"/>
-          <w:szCs w:val="24"/>
-        </w:rPr>
-      </w:pPr>
-    </w:p>
-    <w:p>
-      <w:pPr>
-        <w:rPr>
-          <w:rFonts w:ascii="Roboto" w:hAnsi="Roboto"/>
-          <w:b/>
-          <w:bCs/>
-          <w:sz w:val="24"/>
-          <w:szCs w:val="24"/>
-        </w:rPr>
-      </w:pPr>
-      <w:r>
-        <w:rPr>
-          <w:rFonts w:ascii="Roboto" w:hAnsi="Roboto"/>
-          <w:b/>
-          <w:bCs/>
-          <w:sz w:val="24"/>
-          <w:szCs w:val="24"/>
-        </w:rPr>
-        <w:t>12. Failure Handling &amp; System Degradation</w:t>
-      </w:r>
-    </w:p>
-    <w:p>
-      <w:pPr>
-        <w:rPr>
-          <w:rFonts w:ascii="Roboto" w:hAnsi="Roboto"/>
-          <w:sz w:val="24"/>
-          <w:szCs w:val="24"/>
-        </w:rPr>
-      </w:pPr>
-      <w:r>
-        <w:rPr>
-          <w:rFonts w:ascii="Roboto" w:hAnsi="Roboto"/>
-          <w:sz w:val="24"/>
-          <w:szCs w:val="24"/>
-        </w:rPr>
-        <w:t>If the Shopify API fails, the system stops the audit and informs the user without crashing.</w:t>
-      </w:r>
-      <w:r>
-        <w:rPr>
-          <w:rFonts w:ascii="Roboto" w:hAnsi="Roboto"/>
-          <w:sz w:val="24"/>
-          <w:szCs w:val="24"/>
-        </w:rPr>
-        <w:br/>
-        <w:t>If the primary AI (</w:t>
-      </w:r>
+        <w:t>14. Conclusion</w:t>
+      </w:r>
+    </w:p>
+    <w:p>
+      <w:pPr>
+        <w:rPr>
+          <w:rFonts w:ascii="Roboto" w:hAnsi="Roboto"/>
+        </w:rPr>
+      </w:pPr>
       <w:proofErr w:type="spellStart"/>
       <w:r>
         <w:rPr>
           <w:rFonts w:ascii="Roboto" w:hAnsi="Roboto"/>
-          <w:sz w:val="24"/>
-          <w:szCs w:val="24"/>
-        </w:rPr>
-        <w:t>Groq</w:t>
+        </w:rPr>
+        <w:t>StoreIQ</w:t>
       </w:r>
       <w:proofErr w:type="spellEnd"/>
       <w:r>
         <w:rPr>
           <w:rFonts w:ascii="Roboto" w:hAnsi="Roboto"/>
-          <w:sz w:val="24"/>
-          <w:szCs w:val="24"/>
-        </w:rPr>
-        <w:t>) fails, the system switches to Gemini automatically.</w:t>
-      </w:r>
-      <w:r>
-        <w:rPr>
-          <w:rFonts w:ascii="Roboto" w:hAnsi="Roboto"/>
-          <w:sz w:val="24"/>
-          <w:szCs w:val="24"/>
-        </w:rPr>
-        <w:br/>
-        <w:t>If both AI models fail, the system falls back to rule-based scoring.</w:t>
-      </w:r>
-      <w:r>
-        <w:rPr>
-          <w:rFonts w:ascii="Roboto" w:hAnsi="Roboto"/>
-          <w:sz w:val="24"/>
-          <w:szCs w:val="24"/>
-        </w:rPr>
-        <w:br/>
-        <w:t>Invalid AI responses are filtered, and safe fallback outputs are shown.</w:t>
-      </w:r>
-      <w:r>
-        <w:rPr>
-          <w:rFonts w:ascii="Roboto" w:hAnsi="Roboto"/>
-          <w:sz w:val="24"/>
-          <w:szCs w:val="24"/>
-        </w:rPr>
-        <w:br/>
-        <w:t>Unexpected user input is validated to prevent system failure.</w:t>
-      </w:r>
-    </w:p>
-    <w:p>
-      <w:pPr>
-        <w:rPr>
-          <w:rFonts w:ascii="Roboto" w:hAnsi="Roboto"/>
-          <w:b/>
-          <w:bCs/>
-          <w:sz w:val="24"/>
-          <w:szCs w:val="24"/>
-        </w:rPr>
-      </w:pPr>
-    </w:p>
-    <w:p>
-      <w:pPr>
-        <w:rPr>
-          <w:rFonts w:ascii="Roboto" w:hAnsi="Roboto"/>
-          <w:b/>
-          <w:bCs/>
-          <w:sz w:val="24"/>
-          <w:szCs w:val="24"/>
-        </w:rPr>
-      </w:pPr>
-      <w:r>
-        <w:rPr>
-          <w:rFonts w:ascii="Roboto" w:hAnsi="Roboto"/>
-          <w:b/>
-          <w:bCs/>
-          <w:sz w:val="24"/>
-          <w:szCs w:val="24"/>
-        </w:rPr>
-        <w:t>13. Known Limitations &amp; Future Improvements</w:t>
-      </w:r>
-    </w:p>
-    <w:p>
-      <w:pPr>
-        <w:rPr>
-          <w:rFonts w:ascii="Roboto" w:hAnsi="Roboto"/>
-          <w:sz w:val="24"/>
-          <w:szCs w:val="24"/>
-        </w:rPr>
-      </w:pPr>
-      <w:r>
-        <w:rPr>
-          <w:rFonts w:ascii="Roboto" w:hAnsi="Roboto"/>
-          <w:sz w:val="24"/>
-          <w:szCs w:val="24"/>
-        </w:rPr>
-        <w:t>AI suggestions may vary depending on input quality.</w:t>
-      </w:r>
-      <w:r>
-        <w:rPr>
-          <w:rFonts w:ascii="Roboto" w:hAnsi="Roboto"/>
-          <w:sz w:val="24"/>
-          <w:szCs w:val="24"/>
-        </w:rPr>
-        <w:br/>
-        <w:t>Image analysis is currently limited to availability checks.</w:t>
-      </w:r>
-      <w:r>
-        <w:rPr>
-          <w:rFonts w:ascii="Roboto" w:hAnsi="Roboto"/>
-          <w:sz w:val="24"/>
-          <w:szCs w:val="24"/>
-        </w:rPr>
-        <w:br/>
-        <w:t>System depends on external APIs, which may introduce delays.</w:t>
-      </w:r>
-      <w:r>
-        <w:rPr>
-          <w:rFonts w:ascii="Roboto" w:hAnsi="Roboto"/>
-          <w:sz w:val="24"/>
-          <w:szCs w:val="24"/>
-        </w:rPr>
-        <w:br/>
-        <w:t>Future improvements include advanced image analysis, better prompt tuning, and personalized recommendations.</w:t>
-      </w:r>
-    </w:p>
-    <w:p>
-      <w:pPr>
-        <w:rPr>
-          <w:rFonts w:ascii="Roboto" w:hAnsi="Roboto"/>
-          <w:b/>
-          <w:bCs/>
-          <w:sz w:val="24"/>
-          <w:szCs w:val="24"/>
-        </w:rPr>
-      </w:pPr>
-    </w:p>
-    <w:p>
-      <w:pPr>
-        <w:rPr>
-          <w:rFonts w:ascii="Roboto" w:hAnsi="Roboto"/>
-          <w:b/>
-          <w:bCs/>
-          <w:sz w:val="24"/>
-          <w:szCs w:val="24"/>
-        </w:rPr>
-      </w:pPr>
-      <w:r>
-        <w:rPr>
-          <w:rFonts w:ascii="Roboto" w:hAnsi="Roboto"/>
-          <w:b/>
-          <w:bCs/>
-          <w:sz w:val="24"/>
-          <w:szCs w:val="24"/>
-        </w:rPr>
-        <w:t>14. Conclusion</w:t>
-      </w:r>
-    </w:p>
-    <w:p>
-      <w:pPr>
-        <w:rPr>
-          <w:rFonts w:ascii="Roboto" w:hAnsi="Roboto"/>
-          <w:sz w:val="24"/>
-          <w:szCs w:val="24"/>
-        </w:rPr>
-      </w:pPr>
-      <w:proofErr w:type="spellStart"/>
-      <w:r>
-        <w:rPr>
-          <w:rFonts w:ascii="Roboto" w:hAnsi="Roboto"/>
-          <w:sz w:val="24"/>
-          <w:szCs w:val="24"/>
-        </w:rPr>
-        <w:t>StoreIQ</w:t>
-      </w:r>
-      <w:proofErr w:type="spellEnd"/>
-      <w:r>
-        <w:rPr>
-          <w:rFonts w:ascii="Roboto" w:hAnsi="Roboto"/>
-          <w:sz w:val="24"/>
-          <w:szCs w:val="24"/>
         </w:rPr>
         <w:t xml:space="preserve"> presents a complete AI-driven solution to improve e-commerce product communication.</w:t>
       </w:r>
       <w:r>
         <w:rPr>
           <w:rFonts w:ascii="Roboto" w:hAnsi="Roboto"/>
-          <w:sz w:val="24"/>
-          <w:szCs w:val="24"/>
         </w:rPr>
         <w:br/>
         <w:t>By combining AI perception analysis, rule-based validation, and real-time Shopify integration, it effectively reduces the Perception Gap.</w:t>
@@ -3653,8 +3760,6 @@
       <w:r>
         <w:rPr>
           <w:rFonts w:ascii="Roboto" w:hAnsi="Roboto"/>
-          <w:sz w:val="24"/>
-          <w:szCs w:val="24"/>
         </w:rPr>
         <w:br/>
         <w:t>The system enhances clarity, builds trust, and improves conversion rates, making it a scalable solution for modern e-commerce platforms.</w:t>
@@ -5729,6 +5834,119 @@
     </w:lvl>
   </w:abstractNum>
   <w:abstractNum w:abstractNumId="14" w15:restartNumberingAfterBreak="0">
+    <w:nsid w:val="2421512E"/>
+    <w:multiLevelType w:val="multilevel"/>
+    <w:tmpl w:val="2F2CF5C8"/>
+    <w:lvl w:ilvl="0">
+      <w:start w:val="1"/>
+      <w:numFmt w:val="decimal"/>
+      <w:lvlText w:val="%1."/>
+      <w:lvlJc w:val="left"/>
+      <w:pPr>
+        <w:tabs>
+          <w:tab w:val="num" w:pos="720"/>
+        </w:tabs>
+        <w:ind w:left="720" w:hanging="360"/>
+      </w:pPr>
+    </w:lvl>
+    <w:lvl w:ilvl="1" w:tentative="1">
+      <w:start w:val="1"/>
+      <w:numFmt w:val="decimal"/>
+      <w:lvlText w:val="%2."/>
+      <w:lvlJc w:val="left"/>
+      <w:pPr>
+        <w:tabs>
+          <w:tab w:val="num" w:pos="1440"/>
+        </w:tabs>
+        <w:ind w:left="1440" w:hanging="360"/>
+      </w:pPr>
+    </w:lvl>
+    <w:lvl w:ilvl="2" w:tentative="1">
+      <w:start w:val="1"/>
+      <w:numFmt w:val="decimal"/>
+      <w:lvlText w:val="%3."/>
+      <w:lvlJc w:val="left"/>
+      <w:pPr>
+        <w:tabs>
+          <w:tab w:val="num" w:pos="2160"/>
+        </w:tabs>
+        <w:ind w:left="2160" w:hanging="360"/>
+      </w:pPr>
+    </w:lvl>
+    <w:lvl w:ilvl="3" w:tentative="1">
+      <w:start w:val="1"/>
+      <w:numFmt w:val="decimal"/>
+      <w:lvlText w:val="%4."/>
+      <w:lvlJc w:val="left"/>
+      <w:pPr>
+        <w:tabs>
+          <w:tab w:val="num" w:pos="2880"/>
+        </w:tabs>
+        <w:ind w:left="2880" w:hanging="360"/>
+      </w:pPr>
+    </w:lvl>
+    <w:lvl w:ilvl="4" w:tentative="1">
+      <w:start w:val="1"/>
+      <w:numFmt w:val="decimal"/>
+      <w:lvlText w:val="%5."/>
+      <w:lvlJc w:val="left"/>
+      <w:pPr>
+        <w:tabs>
+          <w:tab w:val="num" w:pos="3600"/>
+        </w:tabs>
+        <w:ind w:left="3600" w:hanging="360"/>
+      </w:pPr>
+    </w:lvl>
+    <w:lvl w:ilvl="5" w:tentative="1">
+      <w:start w:val="1"/>
+      <w:numFmt w:val="decimal"/>
+      <w:lvlText w:val="%6."/>
+      <w:lvlJc w:val="left"/>
+      <w:pPr>
+        <w:tabs>
+          <w:tab w:val="num" w:pos="4320"/>
+        </w:tabs>
+        <w:ind w:left="4320" w:hanging="360"/>
+      </w:pPr>
+    </w:lvl>
+    <w:lvl w:ilvl="6" w:tentative="1">
+      <w:start w:val="1"/>
+      <w:numFmt w:val="decimal"/>
+      <w:lvlText w:val="%7."/>
+      <w:lvlJc w:val="left"/>
+      <w:pPr>
+        <w:tabs>
+          <w:tab w:val="num" w:pos="5040"/>
+        </w:tabs>
+        <w:ind w:left="5040" w:hanging="360"/>
+      </w:pPr>
+    </w:lvl>
+    <w:lvl w:ilvl="7" w:tentative="1">
+      <w:start w:val="1"/>
+      <w:numFmt w:val="decimal"/>
+      <w:lvlText w:val="%8."/>
+      <w:lvlJc w:val="left"/>
+      <w:pPr>
+        <w:tabs>
+          <w:tab w:val="num" w:pos="5760"/>
+        </w:tabs>
+        <w:ind w:left="5760" w:hanging="360"/>
+      </w:pPr>
+    </w:lvl>
+    <w:lvl w:ilvl="8" w:tentative="1">
+      <w:start w:val="1"/>
+      <w:numFmt w:val="decimal"/>
+      <w:lvlText w:val="%9."/>
+      <w:lvlJc w:val="left"/>
+      <w:pPr>
+        <w:tabs>
+          <w:tab w:val="num" w:pos="6480"/>
+        </w:tabs>
+        <w:ind w:left="6480" w:hanging="360"/>
+      </w:pPr>
+    </w:lvl>
+  </w:abstractNum>
+  <w:abstractNum w:abstractNumId="15" w15:restartNumberingAfterBreak="0">
     <w:nsid w:val="245B681A"/>
     <w:multiLevelType w:val="multilevel"/>
     <w:tmpl w:val="15CA6148"/>
@@ -5877,7 +6095,7 @@
       </w:rPr>
     </w:lvl>
   </w:abstractNum>
-  <w:abstractNum w:abstractNumId="15" w15:restartNumberingAfterBreak="0">
+  <w:abstractNum w:abstractNumId="16" w15:restartNumberingAfterBreak="0">
     <w:nsid w:val="2B15013C"/>
     <w:multiLevelType w:val="multilevel"/>
     <w:tmpl w:val="F1002844"/>
@@ -6026,7 +6244,7 @@
       </w:rPr>
     </w:lvl>
   </w:abstractNum>
-  <w:abstractNum w:abstractNumId="16" w15:restartNumberingAfterBreak="0">
+  <w:abstractNum w:abstractNumId="17" w15:restartNumberingAfterBreak="0">
     <w:nsid w:val="2B965AD9"/>
     <w:multiLevelType w:val="multilevel"/>
     <w:tmpl w:val="0E16D08E"/>
@@ -6175,7 +6393,7 @@
       </w:rPr>
     </w:lvl>
   </w:abstractNum>
-  <w:abstractNum w:abstractNumId="17" w15:restartNumberingAfterBreak="0">
+  <w:abstractNum w:abstractNumId="18" w15:restartNumberingAfterBreak="0">
     <w:nsid w:val="2EBC1756"/>
     <w:multiLevelType w:val="multilevel"/>
     <w:tmpl w:val="CEA4DDCE"/>
@@ -6324,7 +6542,7 @@
       </w:rPr>
     </w:lvl>
   </w:abstractNum>
-  <w:abstractNum w:abstractNumId="18" w15:restartNumberingAfterBreak="0">
+  <w:abstractNum w:abstractNumId="19" w15:restartNumberingAfterBreak="0">
     <w:nsid w:val="34FF5560"/>
     <w:multiLevelType w:val="multilevel"/>
     <w:tmpl w:val="0E202D70"/>
@@ -6473,7 +6691,156 @@
       </w:rPr>
     </w:lvl>
   </w:abstractNum>
-  <w:abstractNum w:abstractNumId="19" w15:restartNumberingAfterBreak="0">
+  <w:abstractNum w:abstractNumId="20" w15:restartNumberingAfterBreak="0">
+    <w:nsid w:val="41CD1E8F"/>
+    <w:multiLevelType w:val="multilevel"/>
+    <w:tmpl w:val="0BB68CD6"/>
+    <w:lvl w:ilvl="0">
+      <w:start w:val="1"/>
+      <w:numFmt w:val="bullet"/>
+      <w:lvlText w:val=""/>
+      <w:lvlJc w:val="left"/>
+      <w:pPr>
+        <w:tabs>
+          <w:tab w:val="num" w:pos="720"/>
+        </w:tabs>
+        <w:ind w:left="720" w:hanging="360"/>
+      </w:pPr>
+      <w:rPr>
+        <w:rFonts w:ascii="Symbol" w:hAnsi="Symbol" w:hint="default"/>
+        <w:sz w:val="20"/>
+      </w:rPr>
+    </w:lvl>
+    <w:lvl w:ilvl="1" w:tentative="1">
+      <w:start w:val="1"/>
+      <w:numFmt w:val="bullet"/>
+      <w:lvlText w:val="o"/>
+      <w:lvlJc w:val="left"/>
+      <w:pPr>
+        <w:tabs>
+          <w:tab w:val="num" w:pos="1440"/>
+        </w:tabs>
+        <w:ind w:left="1440" w:hanging="360"/>
+      </w:pPr>
+      <w:rPr>
+        <w:rFonts w:ascii="Courier New" w:hAnsi="Courier New" w:hint="default"/>
+        <w:sz w:val="20"/>
+      </w:rPr>
+    </w:lvl>
+    <w:lvl w:ilvl="2" w:tentative="1">
+      <w:start w:val="1"/>
+      <w:numFmt w:val="bullet"/>
+      <w:lvlText w:val=""/>
+      <w:lvlJc w:val="left"/>
+      <w:pPr>
+        <w:tabs>
+          <w:tab w:val="num" w:pos="2160"/>
+        </w:tabs>
+        <w:ind w:left="2160" w:hanging="360"/>
+      </w:pPr>
+      <w:rPr>
+        <w:rFonts w:ascii="Wingdings" w:hAnsi="Wingdings" w:hint="default"/>
+        <w:sz w:val="20"/>
+      </w:rPr>
+    </w:lvl>
+    <w:lvl w:ilvl="3" w:tentative="1">
+      <w:start w:val="1"/>
+      <w:numFmt w:val="bullet"/>
+      <w:lvlText w:val=""/>
+      <w:lvlJc w:val="left"/>
+      <w:pPr>
+        <w:tabs>
+          <w:tab w:val="num" w:pos="2880"/>
+        </w:tabs>
+        <w:ind w:left="2880" w:hanging="360"/>
+      </w:pPr>
+      <w:rPr>
+        <w:rFonts w:ascii="Wingdings" w:hAnsi="Wingdings" w:hint="default"/>
+        <w:sz w:val="20"/>
+      </w:rPr>
+    </w:lvl>
+    <w:lvl w:ilvl="4" w:tentative="1">
+      <w:start w:val="1"/>
+      <w:numFmt w:val="bullet"/>
+      <w:lvlText w:val=""/>
+      <w:lvlJc w:val="left"/>
+      <w:pPr>
+        <w:tabs>
+          <w:tab w:val="num" w:pos="3600"/>
+        </w:tabs>
+        <w:ind w:left="3600" w:hanging="360"/>
+      </w:pPr>
+      <w:rPr>
+        <w:rFonts w:ascii="Wingdings" w:hAnsi="Wingdings" w:hint="default"/>
+        <w:sz w:val="20"/>
+      </w:rPr>
+    </w:lvl>
+    <w:lvl w:ilvl="5" w:tentative="1">
+      <w:start w:val="1"/>
+      <w:numFmt w:val="bullet"/>
+      <w:lvlText w:val=""/>
+      <w:lvlJc w:val="left"/>
+      <w:pPr>
+        <w:tabs>
+          <w:tab w:val="num" w:pos="4320"/>
+        </w:tabs>
+        <w:ind w:left="4320" w:hanging="360"/>
+      </w:pPr>
+      <w:rPr>
+        <w:rFonts w:ascii="Wingdings" w:hAnsi="Wingdings" w:hint="default"/>
+        <w:sz w:val="20"/>
+      </w:rPr>
+    </w:lvl>
+    <w:lvl w:ilvl="6" w:tentative="1">
+      <w:start w:val="1"/>
+      <w:numFmt w:val="bullet"/>
+      <w:lvlText w:val=""/>
+      <w:lvlJc w:val="left"/>
+      <w:pPr>
+        <w:tabs>
+          <w:tab w:val="num" w:pos="5040"/>
+        </w:tabs>
+        <w:ind w:left="5040" w:hanging="360"/>
+      </w:pPr>
+      <w:rPr>
+        <w:rFonts w:ascii="Wingdings" w:hAnsi="Wingdings" w:hint="default"/>
+        <w:sz w:val="20"/>
+      </w:rPr>
+    </w:lvl>
+    <w:lvl w:ilvl="7" w:tentative="1">
+      <w:start w:val="1"/>
+      <w:numFmt w:val="bullet"/>
+      <w:lvlText w:val=""/>
+      <w:lvlJc w:val="left"/>
+      <w:pPr>
+        <w:tabs>
+          <w:tab w:val="num" w:pos="5760"/>
+        </w:tabs>
+        <w:ind w:left="5760" w:hanging="360"/>
+      </w:pPr>
+      <w:rPr>
+        <w:rFonts w:ascii="Wingdings" w:hAnsi="Wingdings" w:hint="default"/>
+        <w:sz w:val="20"/>
+      </w:rPr>
+    </w:lvl>
+    <w:lvl w:ilvl="8" w:tentative="1">
+      <w:start w:val="1"/>
+      <w:numFmt w:val="bullet"/>
+      <w:lvlText w:val=""/>
+      <w:lvlJc w:val="left"/>
+      <w:pPr>
+        <w:tabs>
+          <w:tab w:val="num" w:pos="6480"/>
+        </w:tabs>
+        <w:ind w:left="6480" w:hanging="360"/>
+      </w:pPr>
+      <w:rPr>
+        <w:rFonts w:ascii="Wingdings" w:hAnsi="Wingdings" w:hint="default"/>
+        <w:sz w:val="20"/>
+      </w:rPr>
+    </w:lvl>
+  </w:abstractNum>
+  <w:abstractNum w:abstractNumId="21" w15:restartNumberingAfterBreak="0">
     <w:nsid w:val="49254CE9"/>
     <w:multiLevelType w:val="multilevel"/>
     <w:tmpl w:val="BBF2C9BE"/>
@@ -6622,7 +6989,7 @@
       </w:rPr>
     </w:lvl>
   </w:abstractNum>
-  <w:abstractNum w:abstractNumId="20" w15:restartNumberingAfterBreak="0">
+  <w:abstractNum w:abstractNumId="22" w15:restartNumberingAfterBreak="0">
     <w:nsid w:val="4B1939E4"/>
     <w:multiLevelType w:val="multilevel"/>
     <w:tmpl w:val="2F287792"/>
@@ -6771,7 +7138,7 @@
       </w:rPr>
     </w:lvl>
   </w:abstractNum>
-  <w:abstractNum w:abstractNumId="21" w15:restartNumberingAfterBreak="0">
+  <w:abstractNum w:abstractNumId="23" w15:restartNumberingAfterBreak="0">
     <w:nsid w:val="504944E7"/>
     <w:multiLevelType w:val="multilevel"/>
     <w:tmpl w:val="3E525A24"/>
@@ -6920,7 +7287,7 @@
       </w:rPr>
     </w:lvl>
   </w:abstractNum>
-  <w:abstractNum w:abstractNumId="22" w15:restartNumberingAfterBreak="0">
+  <w:abstractNum w:abstractNumId="24" w15:restartNumberingAfterBreak="0">
     <w:nsid w:val="52123A28"/>
     <w:multiLevelType w:val="multilevel"/>
     <w:tmpl w:val="A5E4C5B6"/>
@@ -7069,7 +7436,7 @@
       </w:rPr>
     </w:lvl>
   </w:abstractNum>
-  <w:abstractNum w:abstractNumId="23" w15:restartNumberingAfterBreak="0">
+  <w:abstractNum w:abstractNumId="25" w15:restartNumberingAfterBreak="0">
     <w:nsid w:val="53FE7F85"/>
     <w:multiLevelType w:val="multilevel"/>
     <w:tmpl w:val="D8283164"/>
@@ -7218,7 +7585,156 @@
       </w:rPr>
     </w:lvl>
   </w:abstractNum>
-  <w:abstractNum w:abstractNumId="24" w15:restartNumberingAfterBreak="0">
+  <w:abstractNum w:abstractNumId="26" w15:restartNumberingAfterBreak="0">
+    <w:nsid w:val="581D0D80"/>
+    <w:multiLevelType w:val="multilevel"/>
+    <w:tmpl w:val="3BF22572"/>
+    <w:lvl w:ilvl="0">
+      <w:start w:val="1"/>
+      <w:numFmt w:val="bullet"/>
+      <w:lvlText w:val=""/>
+      <w:lvlJc w:val="left"/>
+      <w:pPr>
+        <w:tabs>
+          <w:tab w:val="num" w:pos="720"/>
+        </w:tabs>
+        <w:ind w:left="720" w:hanging="360"/>
+      </w:pPr>
+      <w:rPr>
+        <w:rFonts w:ascii="Symbol" w:hAnsi="Symbol" w:hint="default"/>
+        <w:sz w:val="20"/>
+      </w:rPr>
+    </w:lvl>
+    <w:lvl w:ilvl="1" w:tentative="1">
+      <w:start w:val="1"/>
+      <w:numFmt w:val="bullet"/>
+      <w:lvlText w:val="o"/>
+      <w:lvlJc w:val="left"/>
+      <w:pPr>
+        <w:tabs>
+          <w:tab w:val="num" w:pos="1440"/>
+        </w:tabs>
+        <w:ind w:left="1440" w:hanging="360"/>
+      </w:pPr>
+      <w:rPr>
+        <w:rFonts w:ascii="Courier New" w:hAnsi="Courier New" w:hint="default"/>
+        <w:sz w:val="20"/>
+      </w:rPr>
+    </w:lvl>
+    <w:lvl w:ilvl="2" w:tentative="1">
+      <w:start w:val="1"/>
+      <w:numFmt w:val="bullet"/>
+      <w:lvlText w:val=""/>
+      <w:lvlJc w:val="left"/>
+      <w:pPr>
+        <w:tabs>
+          <w:tab w:val="num" w:pos="2160"/>
+        </w:tabs>
+        <w:ind w:left="2160" w:hanging="360"/>
+      </w:pPr>
+      <w:rPr>
+        <w:rFonts w:ascii="Wingdings" w:hAnsi="Wingdings" w:hint="default"/>
+        <w:sz w:val="20"/>
+      </w:rPr>
+    </w:lvl>
+    <w:lvl w:ilvl="3" w:tentative="1">
+      <w:start w:val="1"/>
+      <w:numFmt w:val="bullet"/>
+      <w:lvlText w:val=""/>
+      <w:lvlJc w:val="left"/>
+      <w:pPr>
+        <w:tabs>
+          <w:tab w:val="num" w:pos="2880"/>
+        </w:tabs>
+        <w:ind w:left="2880" w:hanging="360"/>
+      </w:pPr>
+      <w:rPr>
+        <w:rFonts w:ascii="Wingdings" w:hAnsi="Wingdings" w:hint="default"/>
+        <w:sz w:val="20"/>
+      </w:rPr>
+    </w:lvl>
+    <w:lvl w:ilvl="4" w:tentative="1">
+      <w:start w:val="1"/>
+      <w:numFmt w:val="bullet"/>
+      <w:lvlText w:val=""/>
+      <w:lvlJc w:val="left"/>
+      <w:pPr>
+        <w:tabs>
+          <w:tab w:val="num" w:pos="3600"/>
+        </w:tabs>
+        <w:ind w:left="3600" w:hanging="360"/>
+      </w:pPr>
+      <w:rPr>
+        <w:rFonts w:ascii="Wingdings" w:hAnsi="Wingdings" w:hint="default"/>
+        <w:sz w:val="20"/>
+      </w:rPr>
+    </w:lvl>
+    <w:lvl w:ilvl="5" w:tentative="1">
+      <w:start w:val="1"/>
+      <w:numFmt w:val="bullet"/>
+      <w:lvlText w:val=""/>
+      <w:lvlJc w:val="left"/>
+      <w:pPr>
+        <w:tabs>
+          <w:tab w:val="num" w:pos="4320"/>
+        </w:tabs>
+        <w:ind w:left="4320" w:hanging="360"/>
+      </w:pPr>
+      <w:rPr>
+        <w:rFonts w:ascii="Wingdings" w:hAnsi="Wingdings" w:hint="default"/>
+        <w:sz w:val="20"/>
+      </w:rPr>
+    </w:lvl>
+    <w:lvl w:ilvl="6" w:tentative="1">
+      <w:start w:val="1"/>
+      <w:numFmt w:val="bullet"/>
+      <w:lvlText w:val=""/>
+      <w:lvlJc w:val="left"/>
+      <w:pPr>
+        <w:tabs>
+          <w:tab w:val="num" w:pos="5040"/>
+        </w:tabs>
+        <w:ind w:left="5040" w:hanging="360"/>
+      </w:pPr>
+      <w:rPr>
+        <w:rFonts w:ascii="Wingdings" w:hAnsi="Wingdings" w:hint="default"/>
+        <w:sz w:val="20"/>
+      </w:rPr>
+    </w:lvl>
+    <w:lvl w:ilvl="7" w:tentative="1">
+      <w:start w:val="1"/>
+      <w:numFmt w:val="bullet"/>
+      <w:lvlText w:val=""/>
+      <w:lvlJc w:val="left"/>
+      <w:pPr>
+        <w:tabs>
+          <w:tab w:val="num" w:pos="5760"/>
+        </w:tabs>
+        <w:ind w:left="5760" w:hanging="360"/>
+      </w:pPr>
+      <w:rPr>
+        <w:rFonts w:ascii="Wingdings" w:hAnsi="Wingdings" w:hint="default"/>
+        <w:sz w:val="20"/>
+      </w:rPr>
+    </w:lvl>
+    <w:lvl w:ilvl="8" w:tentative="1">
+      <w:start w:val="1"/>
+      <w:numFmt w:val="bullet"/>
+      <w:lvlText w:val=""/>
+      <w:lvlJc w:val="left"/>
+      <w:pPr>
+        <w:tabs>
+          <w:tab w:val="num" w:pos="6480"/>
+        </w:tabs>
+        <w:ind w:left="6480" w:hanging="360"/>
+      </w:pPr>
+      <w:rPr>
+        <w:rFonts w:ascii="Wingdings" w:hAnsi="Wingdings" w:hint="default"/>
+        <w:sz w:val="20"/>
+      </w:rPr>
+    </w:lvl>
+  </w:abstractNum>
+  <w:abstractNum w:abstractNumId="27" w15:restartNumberingAfterBreak="0">
     <w:nsid w:val="5D9444DF"/>
     <w:multiLevelType w:val="multilevel"/>
     <w:tmpl w:val="A6A6AEA0"/>
@@ -7367,7 +7883,7 @@
       </w:rPr>
     </w:lvl>
   </w:abstractNum>
-  <w:abstractNum w:abstractNumId="25" w15:restartNumberingAfterBreak="0">
+  <w:abstractNum w:abstractNumId="28" w15:restartNumberingAfterBreak="0">
     <w:nsid w:val="608511B4"/>
     <w:multiLevelType w:val="multilevel"/>
     <w:tmpl w:val="B908DC48"/>
@@ -7516,7 +8032,305 @@
       </w:rPr>
     </w:lvl>
   </w:abstractNum>
-  <w:abstractNum w:abstractNumId="26" w15:restartNumberingAfterBreak="0">
+  <w:abstractNum w:abstractNumId="29" w15:restartNumberingAfterBreak="0">
+    <w:nsid w:val="70281183"/>
+    <w:multiLevelType w:val="multilevel"/>
+    <w:tmpl w:val="1AC2C64A"/>
+    <w:lvl w:ilvl="0">
+      <w:start w:val="1"/>
+      <w:numFmt w:val="bullet"/>
+      <w:lvlText w:val=""/>
+      <w:lvlJc w:val="left"/>
+      <w:pPr>
+        <w:tabs>
+          <w:tab w:val="num" w:pos="720"/>
+        </w:tabs>
+        <w:ind w:left="720" w:hanging="360"/>
+      </w:pPr>
+      <w:rPr>
+        <w:rFonts w:ascii="Symbol" w:hAnsi="Symbol" w:hint="default"/>
+        <w:sz w:val="20"/>
+      </w:rPr>
+    </w:lvl>
+    <w:lvl w:ilvl="1" w:tentative="1">
+      <w:start w:val="1"/>
+      <w:numFmt w:val="bullet"/>
+      <w:lvlText w:val="o"/>
+      <w:lvlJc w:val="left"/>
+      <w:pPr>
+        <w:tabs>
+          <w:tab w:val="num" w:pos="1440"/>
+        </w:tabs>
+        <w:ind w:left="1440" w:hanging="360"/>
+      </w:pPr>
+      <w:rPr>
+        <w:rFonts w:ascii="Courier New" w:hAnsi="Courier New" w:hint="default"/>
+        <w:sz w:val="20"/>
+      </w:rPr>
+    </w:lvl>
+    <w:lvl w:ilvl="2" w:tentative="1">
+      <w:start w:val="1"/>
+      <w:numFmt w:val="bullet"/>
+      <w:lvlText w:val=""/>
+      <w:lvlJc w:val="left"/>
+      <w:pPr>
+        <w:tabs>
+          <w:tab w:val="num" w:pos="2160"/>
+        </w:tabs>
+        <w:ind w:left="2160" w:hanging="360"/>
+      </w:pPr>
+      <w:rPr>
+        <w:rFonts w:ascii="Wingdings" w:hAnsi="Wingdings" w:hint="default"/>
+        <w:sz w:val="20"/>
+      </w:rPr>
+    </w:lvl>
+    <w:lvl w:ilvl="3" w:tentative="1">
+      <w:start w:val="1"/>
+      <w:numFmt w:val="bullet"/>
+      <w:lvlText w:val=""/>
+      <w:lvlJc w:val="left"/>
+      <w:pPr>
+        <w:tabs>
+          <w:tab w:val="num" w:pos="2880"/>
+        </w:tabs>
+        <w:ind w:left="2880" w:hanging="360"/>
+      </w:pPr>
+      <w:rPr>
+        <w:rFonts w:ascii="Wingdings" w:hAnsi="Wingdings" w:hint="default"/>
+        <w:sz w:val="20"/>
+      </w:rPr>
+    </w:lvl>
+    <w:lvl w:ilvl="4" w:tentative="1">
+      <w:start w:val="1"/>
+      <w:numFmt w:val="bullet"/>
+      <w:lvlText w:val=""/>
+      <w:lvlJc w:val="left"/>
+      <w:pPr>
+        <w:tabs>
+          <w:tab w:val="num" w:pos="3600"/>
+        </w:tabs>
+        <w:ind w:left="3600" w:hanging="360"/>
+      </w:pPr>
+      <w:rPr>
+        <w:rFonts w:ascii="Wingdings" w:hAnsi="Wingdings" w:hint="default"/>
+        <w:sz w:val="20"/>
+      </w:rPr>
+    </w:lvl>
+    <w:lvl w:ilvl="5" w:tentative="1">
+      <w:start w:val="1"/>
+      <w:numFmt w:val="bullet"/>
+      <w:lvlText w:val=""/>
+      <w:lvlJc w:val="left"/>
+      <w:pPr>
+        <w:tabs>
+          <w:tab w:val="num" w:pos="4320"/>
+        </w:tabs>
+        <w:ind w:left="4320" w:hanging="360"/>
+      </w:pPr>
+      <w:rPr>
+        <w:rFonts w:ascii="Wingdings" w:hAnsi="Wingdings" w:hint="default"/>
+        <w:sz w:val="20"/>
+      </w:rPr>
+    </w:lvl>
+    <w:lvl w:ilvl="6" w:tentative="1">
+      <w:start w:val="1"/>
+      <w:numFmt w:val="bullet"/>
+      <w:lvlText w:val=""/>
+      <w:lvlJc w:val="left"/>
+      <w:pPr>
+        <w:tabs>
+          <w:tab w:val="num" w:pos="5040"/>
+        </w:tabs>
+        <w:ind w:left="5040" w:hanging="360"/>
+      </w:pPr>
+      <w:rPr>
+        <w:rFonts w:ascii="Wingdings" w:hAnsi="Wingdings" w:hint="default"/>
+        <w:sz w:val="20"/>
+      </w:rPr>
+    </w:lvl>
+    <w:lvl w:ilvl="7" w:tentative="1">
+      <w:start w:val="1"/>
+      <w:numFmt w:val="bullet"/>
+      <w:lvlText w:val=""/>
+      <w:lvlJc w:val="left"/>
+      <w:pPr>
+        <w:tabs>
+          <w:tab w:val="num" w:pos="5760"/>
+        </w:tabs>
+        <w:ind w:left="5760" w:hanging="360"/>
+      </w:pPr>
+      <w:rPr>
+        <w:rFonts w:ascii="Wingdings" w:hAnsi="Wingdings" w:hint="default"/>
+        <w:sz w:val="20"/>
+      </w:rPr>
+    </w:lvl>
+    <w:lvl w:ilvl="8" w:tentative="1">
+      <w:start w:val="1"/>
+      <w:numFmt w:val="bullet"/>
+      <w:lvlText w:val=""/>
+      <w:lvlJc w:val="left"/>
+      <w:pPr>
+        <w:tabs>
+          <w:tab w:val="num" w:pos="6480"/>
+        </w:tabs>
+        <w:ind w:left="6480" w:hanging="360"/>
+      </w:pPr>
+      <w:rPr>
+        <w:rFonts w:ascii="Wingdings" w:hAnsi="Wingdings" w:hint="default"/>
+        <w:sz w:val="20"/>
+      </w:rPr>
+    </w:lvl>
+  </w:abstractNum>
+  <w:abstractNum w:abstractNumId="30" w15:restartNumberingAfterBreak="0">
+    <w:nsid w:val="75E35F60"/>
+    <w:multiLevelType w:val="multilevel"/>
+    <w:tmpl w:val="45C63F46"/>
+    <w:lvl w:ilvl="0">
+      <w:start w:val="1"/>
+      <w:numFmt w:val="bullet"/>
+      <w:lvlText w:val=""/>
+      <w:lvlJc w:val="left"/>
+      <w:pPr>
+        <w:tabs>
+          <w:tab w:val="num" w:pos="720"/>
+        </w:tabs>
+        <w:ind w:left="720" w:hanging="360"/>
+      </w:pPr>
+      <w:rPr>
+        <w:rFonts w:ascii="Symbol" w:hAnsi="Symbol" w:hint="default"/>
+        <w:sz w:val="20"/>
+      </w:rPr>
+    </w:lvl>
+    <w:lvl w:ilvl="1" w:tentative="1">
+      <w:start w:val="1"/>
+      <w:numFmt w:val="bullet"/>
+      <w:lvlText w:val="o"/>
+      <w:lvlJc w:val="left"/>
+      <w:pPr>
+        <w:tabs>
+          <w:tab w:val="num" w:pos="1440"/>
+        </w:tabs>
+        <w:ind w:left="1440" w:hanging="360"/>
+      </w:pPr>
+      <w:rPr>
+        <w:rFonts w:ascii="Courier New" w:hAnsi="Courier New" w:hint="default"/>
+        <w:sz w:val="20"/>
+      </w:rPr>
+    </w:lvl>
+    <w:lvl w:ilvl="2" w:tentative="1">
+      <w:start w:val="1"/>
+      <w:numFmt w:val="bullet"/>
+      <w:lvlText w:val=""/>
+      <w:lvlJc w:val="left"/>
+      <w:pPr>
+        <w:tabs>
+          <w:tab w:val="num" w:pos="2160"/>
+        </w:tabs>
+        <w:ind w:left="2160" w:hanging="360"/>
+      </w:pPr>
+      <w:rPr>
+        <w:rFonts w:ascii="Wingdings" w:hAnsi="Wingdings" w:hint="default"/>
+        <w:sz w:val="20"/>
+      </w:rPr>
+    </w:lvl>
+    <w:lvl w:ilvl="3" w:tentative="1">
+      <w:start w:val="1"/>
+      <w:numFmt w:val="bullet"/>
+      <w:lvlText w:val=""/>
+      <w:lvlJc w:val="left"/>
+      <w:pPr>
+        <w:tabs>
+          <w:tab w:val="num" w:pos="2880"/>
+        </w:tabs>
+        <w:ind w:left="2880" w:hanging="360"/>
+      </w:pPr>
+      <w:rPr>
+        <w:rFonts w:ascii="Wingdings" w:hAnsi="Wingdings" w:hint="default"/>
+        <w:sz w:val="20"/>
+      </w:rPr>
+    </w:lvl>
+    <w:lvl w:ilvl="4" w:tentative="1">
+      <w:start w:val="1"/>
+      <w:numFmt w:val="bullet"/>
+      <w:lvlText w:val=""/>
+      <w:lvlJc w:val="left"/>
+      <w:pPr>
+        <w:tabs>
+          <w:tab w:val="num" w:pos="3600"/>
+        </w:tabs>
+        <w:ind w:left="3600" w:hanging="360"/>
+      </w:pPr>
+      <w:rPr>
+        <w:rFonts w:ascii="Wingdings" w:hAnsi="Wingdings" w:hint="default"/>
+        <w:sz w:val="20"/>
+      </w:rPr>
+    </w:lvl>
+    <w:lvl w:ilvl="5" w:tentative="1">
+      <w:start w:val="1"/>
+      <w:numFmt w:val="bullet"/>
+      <w:lvlText w:val=""/>
+      <w:lvlJc w:val="left"/>
+      <w:pPr>
+        <w:tabs>
+          <w:tab w:val="num" w:pos="4320"/>
+        </w:tabs>
+        <w:ind w:left="4320" w:hanging="360"/>
+      </w:pPr>
+      <w:rPr>
+        <w:rFonts w:ascii="Wingdings" w:hAnsi="Wingdings" w:hint="default"/>
+        <w:sz w:val="20"/>
+      </w:rPr>
+    </w:lvl>
+    <w:lvl w:ilvl="6" w:tentative="1">
+      <w:start w:val="1"/>
+      <w:numFmt w:val="bullet"/>
+      <w:lvlText w:val=""/>
+      <w:lvlJc w:val="left"/>
+      <w:pPr>
+        <w:tabs>
+          <w:tab w:val="num" w:pos="5040"/>
+        </w:tabs>
+        <w:ind w:left="5040" w:hanging="360"/>
+      </w:pPr>
+      <w:rPr>
+        <w:rFonts w:ascii="Wingdings" w:hAnsi="Wingdings" w:hint="default"/>
+        <w:sz w:val="20"/>
+      </w:rPr>
+    </w:lvl>
+    <w:lvl w:ilvl="7" w:tentative="1">
+      <w:start w:val="1"/>
+      <w:numFmt w:val="bullet"/>
+      <w:lvlText w:val=""/>
+      <w:lvlJc w:val="left"/>
+      <w:pPr>
+        <w:tabs>
+          <w:tab w:val="num" w:pos="5760"/>
+        </w:tabs>
+        <w:ind w:left="5760" w:hanging="360"/>
+      </w:pPr>
+      <w:rPr>
+        <w:rFonts w:ascii="Wingdings" w:hAnsi="Wingdings" w:hint="default"/>
+        <w:sz w:val="20"/>
+      </w:rPr>
+    </w:lvl>
+    <w:lvl w:ilvl="8" w:tentative="1">
+      <w:start w:val="1"/>
+      <w:numFmt w:val="bullet"/>
+      <w:lvlText w:val=""/>
+      <w:lvlJc w:val="left"/>
+      <w:pPr>
+        <w:tabs>
+          <w:tab w:val="num" w:pos="6480"/>
+        </w:tabs>
+        <w:ind w:left="6480" w:hanging="360"/>
+      </w:pPr>
+      <w:rPr>
+        <w:rFonts w:ascii="Wingdings" w:hAnsi="Wingdings" w:hint="default"/>
+        <w:sz w:val="20"/>
+      </w:rPr>
+    </w:lvl>
+  </w:abstractNum>
+  <w:abstractNum w:abstractNumId="31" w15:restartNumberingAfterBreak="0">
     <w:nsid w:val="7724741D"/>
     <w:multiLevelType w:val="multilevel"/>
     <w:tmpl w:val="8B92E028"/>
@@ -7669,31 +8483,31 @@
     <w:abstractNumId w:val="8"/>
   </w:num>
   <w:num w:numId="2" w16cid:durableId="1376543220">
-    <w:abstractNumId w:val="24"/>
+    <w:abstractNumId w:val="27"/>
   </w:num>
   <w:num w:numId="3" w16cid:durableId="1479303141">
     <w:abstractNumId w:val="4"/>
   </w:num>
   <w:num w:numId="4" w16cid:durableId="1538392402">
-    <w:abstractNumId w:val="17"/>
+    <w:abstractNumId w:val="18"/>
   </w:num>
   <w:num w:numId="5" w16cid:durableId="1017461293">
-    <w:abstractNumId w:val="25"/>
+    <w:abstractNumId w:val="28"/>
   </w:num>
   <w:num w:numId="6" w16cid:durableId="1351487736">
     <w:abstractNumId w:val="9"/>
   </w:num>
   <w:num w:numId="7" w16cid:durableId="1314021908">
-    <w:abstractNumId w:val="18"/>
+    <w:abstractNumId w:val="19"/>
   </w:num>
   <w:num w:numId="8" w16cid:durableId="611862562">
-    <w:abstractNumId w:val="22"/>
+    <w:abstractNumId w:val="24"/>
   </w:num>
   <w:num w:numId="9" w16cid:durableId="766078114">
     <w:abstractNumId w:val="1"/>
   </w:num>
   <w:num w:numId="10" w16cid:durableId="1185748349">
-    <w:abstractNumId w:val="20"/>
+    <w:abstractNumId w:val="22"/>
   </w:num>
   <w:num w:numId="11" w16cid:durableId="2101750617">
     <w:abstractNumId w:val="10"/>
@@ -7702,25 +8516,25 @@
     <w:abstractNumId w:val="12"/>
   </w:num>
   <w:num w:numId="13" w16cid:durableId="2116514016">
-    <w:abstractNumId w:val="26"/>
+    <w:abstractNumId w:val="31"/>
   </w:num>
   <w:num w:numId="14" w16cid:durableId="586115774">
     <w:abstractNumId w:val="0"/>
   </w:num>
   <w:num w:numId="15" w16cid:durableId="314798489">
-    <w:abstractNumId w:val="19"/>
+    <w:abstractNumId w:val="21"/>
   </w:num>
   <w:num w:numId="16" w16cid:durableId="987707237">
-    <w:abstractNumId w:val="21"/>
+    <w:abstractNumId w:val="23"/>
   </w:num>
   <w:num w:numId="17" w16cid:durableId="650209547">
-    <w:abstractNumId w:val="23"/>
+    <w:abstractNumId w:val="25"/>
   </w:num>
   <w:num w:numId="18" w16cid:durableId="2094163688">
     <w:abstractNumId w:val="7"/>
   </w:num>
   <w:num w:numId="19" w16cid:durableId="265234241">
-    <w:abstractNumId w:val="15"/>
+    <w:abstractNumId w:val="16"/>
   </w:num>
   <w:num w:numId="20" w16cid:durableId="1818958166">
     <w:abstractNumId w:val="11"/>
@@ -7738,13 +8552,28 @@
     <w:abstractNumId w:val="3"/>
   </w:num>
   <w:num w:numId="25" w16cid:durableId="1380520188">
-    <w:abstractNumId w:val="14"/>
+    <w:abstractNumId w:val="15"/>
   </w:num>
   <w:num w:numId="26" w16cid:durableId="2146317549">
     <w:abstractNumId w:val="2"/>
   </w:num>
   <w:num w:numId="27" w16cid:durableId="772819026">
-    <w:abstractNumId w:val="16"/>
+    <w:abstractNumId w:val="17"/>
+  </w:num>
+  <w:num w:numId="28" w16cid:durableId="7490884">
+    <w:abstractNumId w:val="26"/>
+  </w:num>
+  <w:num w:numId="29" w16cid:durableId="1645239548">
+    <w:abstractNumId w:val="30"/>
+  </w:num>
+  <w:num w:numId="30" w16cid:durableId="1600486016">
+    <w:abstractNumId w:val="29"/>
+  </w:num>
+  <w:num w:numId="31" w16cid:durableId="1293558516">
+    <w:abstractNumId w:val="20"/>
+  </w:num>
+  <w:num w:numId="32" w16cid:durableId="1324435235">
+    <w:abstractNumId w:val="14"/>
   </w:num>
 </w:numbering>
 </file>
@@ -8665,6 +9494,41 @@
       <w:spacing w:val="5"/>
     </w:rPr>
   </w:style>
+  <w:style w:type="character" w:styleId="Hyperlink">
+    <w:name w:val="Hyperlink"/>
+    <w:basedOn w:val="DefaultParagraphFont"/>
+    <w:uiPriority w:val="99"/>
+    <w:unhideWhenUsed/>
+    <w:rsid w:val="003F78BE"/>
+    <w:rPr>
+      <w:color w:val="0563C1" w:themeColor="hyperlink"/>
+      <w:u w:val="single"/>
+    </w:rPr>
+  </w:style>
+  <w:style w:type="character" w:styleId="UnresolvedMention">
+    <w:name w:val="Unresolved Mention"/>
+    <w:basedOn w:val="DefaultParagraphFont"/>
+    <w:uiPriority w:val="99"/>
+    <w:semiHidden/>
+    <w:unhideWhenUsed/>
+    <w:rsid w:val="003F78BE"/>
+    <w:rPr>
+      <w:color w:val="605E5C"/>
+      <w:shd w:val="clear" w:color="auto" w:fill="E1DFDD"/>
+    </w:rPr>
+  </w:style>
+  <w:style w:type="character" w:styleId="FollowedHyperlink">
+    <w:name w:val="FollowedHyperlink"/>
+    <w:basedOn w:val="DefaultParagraphFont"/>
+    <w:uiPriority w:val="99"/>
+    <w:semiHidden/>
+    <w:unhideWhenUsed/>
+    <w:rsid w:val="003F78BE"/>
+    <w:rPr>
+      <w:color w:val="954F72" w:themeColor="followedHyperlink"/>
+      <w:u w:val="single"/>
+    </w:rPr>
+  </w:style>
 </w:styles>
 </file>
 

</xml_diff>